<commit_message>
Atualiza entrega/ com o build corrente (4.7 aplicado)
Co-Authored-By: Claude Sonnet 5 <noreply@anthropic.com>
Claude-Session: https://claude.ai/code/session_01XzLJbVW5f4oFiSv8aWq7jT
</commit_message>
<xml_diff>
--- a/dialetica_viva/entrega/A Dialética Viva - Pedro Perússolo.docx
+++ b/dialetica_viva/entrega/A Dialética Viva - Pedro Perússolo.docx
@@ -586,7 +586,7 @@
           <w:szCs w:val="24"/>
           <w:rtl w:val="0"/>
         </w:rPr>
-        <w:t xml:space="preserve"> publicada pela Editora Vozes, com indicação do volume e, quando pertinente, do parágrafo. Onde a formulação de um autor é reconstruída em vez de citada literalmente, a nota o indica com a expressão "paráfrase nossa". As obras de Giegerich, que ainda não dispõem de tradução para o português, são citadas a partir das edições em inglês; as de Deleuze, Lacan e Hegel, a partir das traduções brasileiras, quando disponíveis. As referências completas de cada Estação estão reunidas, ao final do volume, numa bibliografia geral, precedida de um glossário dos conceitos centrais.</w:t>
+        <w:t xml:space="preserve"> publicada pela Editora Vozes, com indicação do volume e, quando pertinente, do parágrafo. Onde a formulação de um autor é reconstruída em vez de citada literalmente, a nota o indica com a expressão "paráfrase nossa". As obras de Giegerich, que ainda não dispõem de tradução para o português, são citadas a partir das edições em inglês; as de Deleuze, Lacan e Hegel, a partir das traduções brasileiras, quando disponíveis. Duas exceções a essa regra merecem registro: a Ciência da lógica é citada integralmente pela edição inglesa de A. V. Miller, cuja numeração de parágrafos é a mais usada na literatura secundária consultada, ainda que exista tradução brasileira; e duas obras de Deleuze sem tradução para o português — Nietzsche y la filosofía e Spinoza: filosofía práctica — são citadas pelas edições espanholas. Advertência semelhante vale para Tipos psicológicos: o verbete "Símbolo" é citado ora pela numeração de parágrafo da edição brasileira (§§903, 905, 906), ora pela da edição inglesa de R. F. C. Hull (§§825, 827) quando a formulação citada é traduzida diretamente do inglês; cada nota indica a qual das duas se refere. As referências completas de cada Estação estão reunidas, ao final do volume, numa bibliografia geral, precedida de um glossário dos conceitos centrais.</w:t>
       </w:r>
       <w:r>
         <w:rPr>
@@ -17505,29 +17505,29 @@
           <w:szCs w:val="24"/>
           <w:rtl w:val="0"/>
         </w:rPr>
-        <w:t xml:space="preserve">Daí não se segue que Giegerich simplesmente reproduza os preconceitos de Hegel. O seu argumento visa a forma lógica da consciência, e não as mulheres nem o feminino como categoria antropológica; ele poderia responder que a leitura aqui proposta confunde, precisamente, os planos que a diferença psicológica pretende separar. A coincidência, porém, não é acidental: quando a dialética é pensada como movimento que vai da imediatez natural à mediação conceitual, aquilo que é culturalmente associado à natureza, ao corpo e à imediatez tende a ocupar, na estrutura, o lugar do que deve ser suprimido. A questão é de estrutura, não de intenção — e a estrutura é a da </w:t>
-      </w:r>
-      <w:r>
-        <w:rPr>
-          <w:rFonts w:ascii="Times New Roman" w:cs="Times New Roman" w:eastAsia="Times New Roman" w:hAnsi="Times New Roman"/>
-          <w:color w:val="000000"/>
-          <w:sz w:val="24"/>
-          <w:szCs w:val="24"/>
-          <w:rtl w:val="0"/>
-          <w:i w:val="1"/>
-          <w:iCs w:val="1"/>
-        </w:rPr>
-        <w:t xml:space="preserve">Aufhebung</w:t>
-      </w:r>
-      <w:r>
-        <w:rPr>
-          <w:rFonts w:ascii="Times New Roman" w:cs="Times New Roman" w:eastAsia="Times New Roman" w:hAnsi="Times New Roman"/>
-          <w:color w:val="000000"/>
-          <w:sz w:val="24"/>
-          <w:szCs w:val="24"/>
-          <w:rtl w:val="0"/>
-        </w:rPr>
-        <w:t xml:space="preserve">.</w:t>
+        <w:t xml:space="preserve">Daí não se segue que Giegerich simplesmente reproduza os preconceitos de Hegel. O seu argumento visa a forma lógica da consciência, e não as mulheres nem o feminino como categoria antropológica; ele poderia responder que a leitura aqui proposta confunde, precisamente, os planos que a diferença psicológica pretende separar. A coincidência, porém, não é acidental — nem por isso é necessária no sentido forte que a Estação 3 recusou. A forma da Aufhebung exige que algum termo ocupe o lugar do que deve ser suprimido; não exige que esse termo seja a natureza, o corpo ou o feminino. O que explica a coincidência não é a lógica do procedimento, mas o mesmo repertório cultural que já associava o feminino à imediatez em Hegel: onde esse repertório está disponível, é ele, e não a forma da Aufhebung, que decide qual termo ocupa o lugar vago.</w:t>
+      </w:r>
+      <w:r>
+        <w:rPr>
+          <w:rFonts w:ascii="Times New Roman" w:cs="Times New Roman" w:eastAsia="Times New Roman" w:hAnsi="Times New Roman"/>
+          <w:color w:val="000000"/>
+          <w:sz w:val="24"/>
+          <w:szCs w:val="24"/>
+          <w:rtl w:val="0"/>
+          <w:i w:val="1"/>
+          <w:iCs w:val="1"/>
+        </w:rPr>
+        <w:t xml:space="preserve"/>
+      </w:r>
+      <w:r>
+        <w:rPr>
+          <w:rFonts w:ascii="Times New Roman" w:cs="Times New Roman" w:eastAsia="Times New Roman" w:hAnsi="Times New Roman"/>
+          <w:color w:val="000000"/>
+          <w:sz w:val="24"/>
+          <w:szCs w:val="24"/>
+          <w:rtl w:val="0"/>
+        </w:rPr>
+        <w:t xml:space="preserve"/>
       </w:r>
       <w:r>
         <w:rPr>
@@ -18728,7 +18728,7 @@
           <w:szCs w:val="24"/>
           <w:rtl w:val="0"/>
         </w:rPr>
-        <w:t xml:space="preserve">Há uma segunda razão para o desvio, mais diretamente ligada ao fio que atravessa o percurso. O feminino aparece duas vezes no lugar do que a dialética precisa superar: em Hegel, como a lei divina de Antígona suprimida pela universalidade do Estado; em Giegerich, como o quarto elemento cuja reintegração na imagem divina representaria uma regressão. A fórmula lacaniana segundo a qual "A Mulher não existe" parece, à primeira vista, radicalizar esse gesto. Ela diz, porém, outra coisa — e essa outra coisa, embora escape à teleologia hegeliana, mantém o feminino num regime de definição negativa que Deleuze tentará romper.</w:t>
+        <w:t xml:space="preserve">Há uma segunda razão para o desvio, mais diretamente ligada ao fio que atravessa o percurso. O feminino aparece duas vezes no lugar do que cada dialética efetivamente superou: em Hegel, como a lei divina de Antígona suprimida pela universalidade do Estado; em Giegerich, como o quarto elemento cuja reintegração na imagem divina representaria uma regressão. A fórmula lacaniana segundo a qual "A Mulher não existe" parece, à primeira vista, radicalizar esse gesto. Ela diz, porém, outra coisa — e essa outra coisa, embora escape à teleologia hegeliana, mantém o feminino num regime de definição negativa que Deleuze tentará romper.</w:t>
       </w:r>
       <w:r>
         <w:rPr>
@@ -23962,7 +23962,7 @@
           <w:szCs w:val="24"/>
           <w:rtl w:val="0"/>
         </w:rPr>
-        <w:t xml:space="preserve">Em Hegel, em Giegerich e em Lacan, o feminino aparece no lugar do que a dialética não consegue pensar em si mesmo. A Antígona de Hegel era o momento da lei divina que o espírito precisava suprimir para chegar à universalidade do Estado. O quarto elemento que Jung acrescentava à Trindade era lido por Giegerich como regressão da forma lógica do cristianismo à imagem natural da Mãe. A Mulher lacaniana escapava à totalidade apenas sob a condição de ser definida como não-toda em relação à função fálica. Em cada caso, o feminino era pensado a partir de outro termo — como momento, como complemento, como falta.</w:t>
+        <w:t xml:space="preserve">Em Hegel, em Giegerich e em Lacan, o feminino aparece no lugar do que a dialética não consegue pensar em si mesmo. A Antígona de Hegel era o momento da lei divina que o espírito de fato suprimiu para chegar à universalidade do Estado. O quarto elemento que Jung acrescentava à Trindade era lido por Giegerich como regressão da forma lógica do cristianismo à imagem natural da Mãe. A Mulher lacaniana escapava à totalidade apenas sob a condição de ser definida como não-toda em relação à função fálica. Em cada caso, o feminino era pensado a partir de outro termo — como momento, como complemento, como falta.</w:t>
       </w:r>
       <w:r>
         <w:rPr>

</xml_diff>

<commit_message>
Porta 2 correções reais do arquivo "versão 8" recebido do Pedro
Nota Mills (pp.62/64→63/65 + esclarecimento sobre nota 4) e nome do
corpo do texto (Ana→Amnéris Maroni, confirmado por fonte externa).

O resto do que o relato anexo ao arquivo alegava (conferência de
Irigaray/Lacan/Deleuze etc., 32 cortes de redundância, sumário
corrigido) não está presente no arquivo em si — documentado em
avaliacoes/conferencia_citacoes_4.6.md. O arquivo recebido é anterior
ao trabalho desta sessão em 4.3 e 4.5.
</commit_message>
<xml_diff>
--- a/dialetica_viva/entrega/A Dialética Viva - Pedro Perússolo.docx
+++ b/dialetica_viva/entrega/A Dialética Viva - Pedro Perússolo.docx
@@ -22779,7 +22779,7 @@
           <w:szCs w:val="24"/>
           <w:rtl w:val="0"/>
         </w:rPr>
-        <w:t xml:space="preserve">. Ana Maroni formulou com precisão o que essa virada antecipava: "Foi exatamente isso que Jung percebeu quando rompeu com a psicanálise. Denunciou esse fato sessenta anos antes de O Anti-Édipo, de Gilles Deleuze e Félix Guattari: o desejo comportado da psicanálise não dá conta da explosão delirante da psicose"</w:t>
+        <w:t xml:space="preserve">. Amnéris Maroni formulou com precisão o que essa virada antecipava: "Foi exatamente isso que Jung percebeu quando rompeu com a psicanálise. Denunciou esse fato sessenta anos antes de O Anti-Édipo, de Gilles Deleuze e Félix Guattari: o desejo comportado da psicanálise não dá conta da explosão delirante da psicose"</w:t>
       </w:r>
       <w:r>
         <w:rPr>
@@ -41731,17 +41731,17 @@
           <w:szCs w:val="20"/>
           <w:rtl w:val="0"/>
         </w:rPr>
-        <w:t xml:space="preserve">17(3), 57-77, pp. 62 e 64 e nota 4</w:t>
-      </w:r>
-      <w:r>
-        <w:rPr>
-          <w:rFonts w:ascii="Times New Roman" w:cs="Times New Roman" w:eastAsia="Times New Roman" w:hAnsi="Times New Roman"/>
-          <w:color w:val="000000"/>
-          <w:sz w:val="20"/>
-          <w:szCs w:val="20"/>
-          <w:rtl w:val="0"/>
-        </w:rPr>
-        <w:t xml:space="preserve">. https://doi.org/10.1080/19342039.2023.2225749. Tradução nossa. A divisão da função transcendente em três aspectos, que Mills relê como estágios de uma suprassunção, é tomada por ele de Jeffrey Miller.</w:t>
+        <w:t xml:space="preserve">17(3), 57-77, pp. 63 e 65 e nota 4</w:t>
+      </w:r>
+      <w:r>
+        <w:rPr>
+          <w:rFonts w:ascii="Times New Roman" w:cs="Times New Roman" w:eastAsia="Times New Roman" w:hAnsi="Times New Roman"/>
+          <w:color w:val="000000"/>
+          <w:sz w:val="20"/>
+          <w:szCs w:val="20"/>
+          <w:rtl w:val="0"/>
+        </w:rPr>
+        <w:t xml:space="preserve">. https://doi.org/10.1080/19342039.2023.2225749. Tradução nossa. As duas últimas frases citadas pertencem à nota final 4 do artigo, não ao corpo do texto. A divisão da função transcendente em três aspectos, que Mills relê como estágios de uma suprassunção, é tomada por ele de Jeffrey Miller.</w:t>
       </w:r>
       <w:r>
         <w:rPr>

</xml_diff>

<commit_message>
Copidesque mecânico: 21 correções + revisão de itálico consistente
9 aspas de fechamento soltas em citações em bloco, 10 espaços
sobrando em início/fim de parágrafo, e itálico inconsistente em
Aufhebung (2/31) e telos (1/4). Varredura sistemática por regex em
document.xml e footnotes.xml, documentada em avaliacoes/copidesque.md
com os falsos positivos descartados. Grosz (nota 199) e Kerslake
(nota 172) continuam bloqueados pelo limite de extração de PDFs
grandes — sem mudança de status.
</commit_message>
<xml_diff>
--- a/dialetica_viva/entrega/A Dialética Viva - Pedro Perússolo.docx
+++ b/dialetica_viva/entrega/A Dialética Viva - Pedro Perússolo.docx
@@ -2143,7 +2143,7 @@
           <w:szCs w:val="24"/>
           <w:rtl w:val="0"/>
         </w:rPr>
-        <w:t xml:space="preserve">: suprimir e conservar ao mesmo tempo. Ele escreve, na observação que segue à passagem sobre o devir: </w:t>
+        <w:t xml:space="preserve">: suprimir e conservar ao mesmo tempo. Ele escreve, na observação que segue à passagem sobre o devir:</w:t>
       </w:r>
     </w:p>
     <w:p>
@@ -3103,7 +3103,7 @@
           <w:szCs w:val="22"/>
           <w:rtl w:val="0"/>
         </w:rPr>
-        <w:t xml:space="preserve">Porque o resultado, a negação, é uma negação determinada, ela tem um conteúdo. É um novo conceito, porém mais elevado e mais rico do que o precedente, pois se enriqueceu pela negação ou pelo oposto deste, e portanto o contém, mas também algo mais, e é a unidade de si mesmo e do seu oposto"</w:t>
+        <w:t xml:space="preserve">Porque o resultado, a negação, é uma negação determinada, ela tem um conteúdo. É um novo conceito, porém mais elevado e mais rico do que o precedente, pois se enriqueceu pela negação ou pelo oposto deste, e portanto o contém, mas também algo mais, e é a unidade de si mesmo e do seu oposto.</w:t>
       </w:r>
       <w:r>
         <w:rPr>
@@ -3113,7 +3113,7 @@
           <w:szCs w:val="22"/>
           <w:rtl w:val="0"/>
         </w:rPr>
-        <w:t xml:space="preserve">.</w:t>
+        <w:t xml:space="preserve"/>
       </w:r>
       <w:r>
         <w:rPr>
@@ -3585,7 +3585,7 @@
           <w:szCs w:val="22"/>
           <w:rtl w:val="0"/>
         </w:rPr>
-        <w:t xml:space="preserve">Determinação é a determinidade afirmativa como o em-si com o qual o algo, em seu ser-aí, permanece em acordo diante do seu enredamento com o outro pelo qual poderia ser determinado, mantendo-se em sua igualdade consigo e fazendo valer a sua determinação em seu ser-para-outro"</w:t>
+        <w:t xml:space="preserve">Determinação é a determinidade afirmativa como o em-si com o qual o algo, em seu ser-aí, permanece em acordo diante do seu enredamento com o outro pelo qual poderia ser determinado, mantendo-se em sua igualdade consigo e fazendo valer a sua determinação em seu ser-para-outro.</w:t>
       </w:r>
       <w:r>
         <w:rPr>
@@ -3595,7 +3595,7 @@
           <w:szCs w:val="22"/>
           <w:rtl w:val="0"/>
         </w:rPr>
-        <w:t xml:space="preserve">.</w:t>
+        <w:t xml:space="preserve"/>
       </w:r>
       <w:r>
         <w:rPr>
@@ -3898,7 +3898,7 @@
           <w:szCs w:val="22"/>
           <w:rtl w:val="0"/>
         </w:rPr>
-        <w:t xml:space="preserve">é uma forma de vida autoconsciente, isto é, é uma forma de vida que desenvolveu várias práticas sociais para refletir sobre o que ela toma como autoritativo para si mesma, quanto a saber se essas práticas estão à altura das suas próprias pretensões e alcançam os fins que elas mesmas estabelecem"</w:t>
+        <w:t xml:space="preserve">é uma forma de vida autoconsciente, isto é, é uma forma de vida que desenvolveu várias práticas sociais para refletir sobre o que ela toma como autoritativo para si mesma, quanto a saber se essas práticas estão à altura das suas próprias pretensões e alcançam os fins que elas mesmas estabelecem.</w:t>
       </w:r>
       <w:r>
         <w:rPr>
@@ -3908,7 +3908,7 @@
           <w:szCs w:val="22"/>
           <w:rtl w:val="0"/>
         </w:rPr>
-        <w:t xml:space="preserve">.</w:t>
+        <w:t xml:space="preserve"/>
       </w:r>
       <w:r>
         <w:rPr>
@@ -4147,7 +4147,7 @@
           <w:szCs w:val="22"/>
           <w:rtl w:val="0"/>
         </w:rPr>
-        <w:t xml:space="preserve">Tal história dialética não afirma que as 'formações da consciência' posteriores estivessem 'fadadas' a suceder as formas anteriores, ou que as formas anteriores estivessem 'visando' as posteriores; ela afirma que apenas elas (ou algo muito parecido com elas) podem ser vistas retrospectivamente como tendo completado as anteriores, como tendo fornecido uma estrutura que, retrospectivamente, pode ser compreendida como tendo resolvido as insuficiências das anteriores, de tal maneira que essa forma de vida posterior tem em si os recursos para justificar o seu modo de tomar as coisas como compensando as insuficiências das formas de vida reflexivas anteriores"</w:t>
+        <w:t xml:space="preserve">Tal história dialética não afirma que as 'formações da consciência' posteriores estivessem 'fadadas' a suceder as formas anteriores, ou que as formas anteriores estivessem 'visando' as posteriores; ela afirma que apenas elas (ou algo muito parecido com elas) podem ser vistas retrospectivamente como tendo completado as anteriores, como tendo fornecido uma estrutura que, retrospectivamente, pode ser compreendida como tendo resolvido as insuficiências das anteriores, de tal maneira que essa forma de vida posterior tem em si os recursos para justificar o seu modo de tomar as coisas como compensando as insuficiências das formas de vida reflexivas anteriores.</w:t>
       </w:r>
       <w:r>
         <w:rPr>
@@ -4157,7 +4157,7 @@
           <w:szCs w:val="22"/>
           <w:rtl w:val="0"/>
         </w:rPr>
-        <w:t xml:space="preserve">.</w:t>
+        <w:t xml:space="preserve"/>
       </w:r>
       <w:r>
         <w:rPr>
@@ -5951,7 +5951,7 @@
           <w:szCs w:val="22"/>
           <w:rtl w:val="0"/>
         </w:rPr>
-        <w:t xml:space="preserve">A relação [entre homem e mulher] em sua forma não mesclada encontra-se, porém, naquela entre irmão e irmã. Eles são o mesmo sangue, que neles, contudo, alcançou um estado de repouso e equilíbrio. Por isso não se desejam um ao outro, nem deram um ao outro ou receberam um do outro esse ser-para-si independente; ao contrário, são individualidades livres um em relação ao outro"</w:t>
+        <w:t xml:space="preserve">A relação [entre homem e mulher] em sua forma não mesclada encontra-se, porém, naquela entre irmão e irmã. Eles são o mesmo sangue, que neles, contudo, alcançou um estado de repouso e equilíbrio. Por isso não se desejam um ao outro, nem deram um ao outro ou receberam um do outro esse ser-para-si independente; ao contrário, são individualidades livres um em relação ao outro.</w:t>
       </w:r>
       <w:r>
         <w:rPr>
@@ -5961,7 +5961,7 @@
           <w:szCs w:val="22"/>
           <w:rtl w:val="0"/>
         </w:rPr>
-        <w:t xml:space="preserve">.</w:t>
+        <w:t xml:space="preserve"/>
       </w:r>
       <w:r>
         <w:rPr>
@@ -6010,7 +6010,7 @@
           <w:szCs w:val="24"/>
           <w:rtl w:val="0"/>
         </w:rPr>
-        <w:t xml:space="preserve">O que Hegel atribui à irmã nessa relação depurada tem duas faces, e a segunda desfaz boa parte do que a primeira concede. De um lado, "o feminino, na forma da irmã, tem a mais alta consciência intuitiva do que é ético". De outro, na continuação imediata da mesma frase, </w:t>
+        <w:t xml:space="preserve">O que Hegel atribui à irmã nessa relação depurada tem duas faces, e a segunda desfaz boa parte do que a primeira concede. De um lado, "o feminino, na forma da irmã, tem a mais alta consciência intuitiva do que é ético". De outro, na continuação imediata da mesma frase,</w:t>
       </w:r>
     </w:p>
     <w:p>
@@ -6166,7 +6166,7 @@
           <w:szCs w:val="22"/>
           <w:rtl w:val="0"/>
         </w:rPr>
-        <w:t xml:space="preserve">Uma vez que a comunidade só obtém existência por meio da sua interferência na felicidade da Família e da dissolução da autoconsciência [individual] no universal, ela cria para si, naquilo que reprime e que ao mesmo tempo lhe é essencial, um inimigo interno: a feminilidade em geral. A feminilidade, a eterna ironia [na vida] da comunidade, converte por intriga o fim universal do governo em fim privado, transforma a sua atividade universal em obra de algum indivíduo particular e perverte a propriedade universal do Estado em posse e ornamento da Família"</w:t>
+        <w:t xml:space="preserve">Uma vez que a comunidade só obtém existência por meio da sua interferência na felicidade da Família e da dissolução da autoconsciência [individual] no universal, ela cria para si, naquilo que reprime e que ao mesmo tempo lhe é essencial, um inimigo interno: a feminilidade em geral. A feminilidade, a eterna ironia [na vida] da comunidade, converte por intriga o fim universal do governo em fim privado, transforma a sua atividade universal em obra de algum indivíduo particular e perverte a propriedade universal do Estado em posse e ornamento da Família.</w:t>
       </w:r>
       <w:r>
         <w:rPr>
@@ -6176,7 +6176,7 @@
           <w:szCs w:val="22"/>
           <w:rtl w:val="0"/>
         </w:rPr>
-        <w:t xml:space="preserve">.</w:t>
+        <w:t xml:space="preserve"/>
       </w:r>
       <w:r>
         <w:rPr>
@@ -6336,7 +6336,7 @@
           <w:szCs w:val="22"/>
           <w:rtl w:val="0"/>
         </w:rPr>
-        <w:t xml:space="preserve">spetta alla femminilità, custode del legame con il sangue, il compito di raccogliere la virilità in figura conclusa, permettendo così che si elevi alla pace dell'universalità pura, fuori e sopra l'inquietudine della vita contingente e della successione di un esserci disperso"</w:t>
+        <w:t xml:space="preserve">spetta alla femminilità, custode del legame con il sangue, il compito di raccogliere la virilità in figura conclusa, permettendo così che si elevi alla pace dell'universalità pura, fuori e sopra l'inquietudine della vita contingente e della successione di un esserci disperso.</w:t>
       </w:r>
       <w:r>
         <w:rPr>
@@ -6346,7 +6346,7 @@
           <w:szCs w:val="22"/>
           <w:rtl w:val="0"/>
         </w:rPr>
-        <w:t xml:space="preserve">.</w:t>
+        <w:t xml:space="preserve"/>
       </w:r>
       <w:r>
         <w:rPr>
@@ -6408,7 +6408,7 @@
           <w:szCs w:val="22"/>
           <w:rtl w:val="0"/>
         </w:rPr>
-        <w:t xml:space="preserve">cabe à feminilidade, guardiã do vínculo com o sangue, a tarefa de recolher a virilidade em figura acabada, permitindo assim que ela se eleve à paz da universalidade pura, fora e acima da inquietude da vida contingente e da sucessão de um existir disperso</w:t>
+        <w:t xml:space="preserve">cabe à feminilidade, guardiã do vínculo com o sangue, a tarefa de recolher a virilidade em figura acabada, permitindo assim que ela se eleve à paz da universalidade pura, fora e acima da inquietude da vida contingente e da sucessão de um existir disperso.</w:t>
       </w:r>
       <w:r>
         <w:rPr>
@@ -6416,7 +6416,7 @@
           <w:szCs w:val="22"/>
           <w:rtl w:val="0"/>
         </w:rPr>
-        <w:t xml:space="preserve">"</w:t>
+        <w:t xml:space="preserve"/>
       </w:r>
       <w:r>
         <w:rPr>
@@ -8893,8 +8893,6 @@
       <w:r>
         <w:rPr>
           <w:rFonts w:ascii="Times New Roman" w:cs="Times New Roman" w:eastAsia="Times New Roman" w:hAnsi="Times New Roman"/>
-          <w:i w:val="1"/>
-          <w:iCs w:val="1"/>
           <w:color w:val="000000"/>
           <w:sz w:val="24"/>
           <w:szCs w:val="24"/>
@@ -9134,7 +9132,7 @@
           <w:szCs w:val="22"/>
           <w:rtl w:val="0"/>
         </w:rPr>
-        <w:t xml:space="preserve">, mas um movimento que sai da suspensão entre os opostos, um nascimento vivo que conduz a um novo nível do ser, a uma nova situação"</w:t>
+        <w:t xml:space="preserve">, mas um movimento que sai da suspensão entre os opostos, um nascimento vivo que conduz a um novo nível do ser, a uma nova situação.</w:t>
       </w:r>
       <w:r>
         <w:rPr>
@@ -9144,7 +9142,7 @@
           <w:szCs w:val="22"/>
           <w:rtl w:val="0"/>
         </w:rPr>
-        <w:t xml:space="preserve">.</w:t>
+        <w:t xml:space="preserve"/>
       </w:r>
       <w:r>
         <w:rPr>
@@ -11126,7 +11124,7 @@
           <w:szCs w:val="24"/>
           <w:rtl w:val="0"/>
         </w:rPr>
-        <w:t xml:space="preserve">A passagem decisiva vem pouco depois, quando Jung propõe o terceiro termo: </w:t>
+        <w:t xml:space="preserve">A passagem decisiva vem pouco depois, quando Jung propõe o terceiro termo:</w:t>
       </w:r>
     </w:p>
     <w:p>
@@ -17505,7 +17503,51 @@
           <w:szCs w:val="24"/>
           <w:rtl w:val="0"/>
         </w:rPr>
-        <w:t xml:space="preserve">Daí não se segue que Giegerich simplesmente reproduza os preconceitos de Hegel. O seu argumento visa a forma lógica da consciência, e não as mulheres nem o feminino como categoria antropológica; ele poderia responder que a leitura aqui proposta confunde, precisamente, os planos que a diferença psicológica pretende separar. A coincidência, porém, não é acidental — nem por isso é necessária no sentido forte que a Estação 3 recusou. A forma da Aufhebung exige que algum termo ocupe o lugar do que deve ser suprimido; não exige que esse termo seja a natureza, o corpo ou o feminino. O que explica a coincidência não é a lógica do procedimento, mas o mesmo repertório cultural que já associava o feminino à imediatez em Hegel: onde esse repertório está disponível, é ele, e não a forma da Aufhebung, que decide qual termo ocupa o lugar vago.</w:t>
+        <w:t xml:space="preserve">Daí não se segue que Giegerich simplesmente reproduza os preconceitos de Hegel. O seu argumento visa a forma lógica da consciência, e não as mulheres nem o feminino como categoria antropológica; ele poderia responder que a leitura aqui proposta confunde, precisamente, os planos que a diferença psicológica pretende separar. A coincidência, porém, não é acidental — nem por isso é necessária no sentido forte que a Estação 3 recusou. A forma da </w:t>
+      </w:r>
+      <w:r>
+        <w:rPr>
+          <w:rFonts w:ascii="Times New Roman" w:cs="Times New Roman" w:eastAsia="Times New Roman" w:hAnsi="Times New Roman"/>
+          <w:color w:val="000000"/>
+          <w:sz w:val="24"/>
+          <w:szCs w:val="24"/>
+          <w:rtl w:val="0"/>
+          <w:i w:val="1"/>
+          <w:iCs w:val="1"/>
+        </w:rPr>
+        <w:t xml:space="preserve">Aufhebung</w:t>
+      </w:r>
+      <w:r>
+        <w:rPr>
+          <w:rFonts w:ascii="Times New Roman" w:cs="Times New Roman" w:eastAsia="Times New Roman" w:hAnsi="Times New Roman"/>
+          <w:color w:val="000000"/>
+          <w:sz w:val="24"/>
+          <w:szCs w:val="24"/>
+          <w:rtl w:val="0"/>
+        </w:rPr>
+        <w:t xml:space="preserve"> exige que algum termo ocupe o lugar do que deve ser suprimido; não exige que esse termo seja a natureza, o corpo ou o feminino. O que explica a coincidência não é a lógica do procedimento, mas o mesmo repertório cultural que já associava o feminino à imediatez em Hegel: onde esse repertório está disponível, é ele, e não a forma da </w:t>
+      </w:r>
+      <w:r>
+        <w:rPr>
+          <w:rFonts w:ascii="Times New Roman" w:cs="Times New Roman" w:eastAsia="Times New Roman" w:hAnsi="Times New Roman"/>
+          <w:color w:val="000000"/>
+          <w:sz w:val="24"/>
+          <w:szCs w:val="24"/>
+          <w:rtl w:val="0"/>
+          <w:i w:val="1"/>
+          <w:iCs w:val="1"/>
+        </w:rPr>
+        <w:t xml:space="preserve">Aufhebung</w:t>
+      </w:r>
+      <w:r>
+        <w:rPr>
+          <w:rFonts w:ascii="Times New Roman" w:cs="Times New Roman" w:eastAsia="Times New Roman" w:hAnsi="Times New Roman"/>
+          <w:color w:val="000000"/>
+          <w:sz w:val="24"/>
+          <w:szCs w:val="24"/>
+          <w:rtl w:val="0"/>
+        </w:rPr>
+        <w:t xml:space="preserve">, que decide qual termo ocupa o lugar vago.</w:t>
       </w:r>
       <w:r>
         <w:rPr>
@@ -22517,7 +22559,7 @@
           <w:szCs w:val="24"/>
           <w:rtl w:val="0"/>
         </w:rPr>
-        <w:t xml:space="preserve">Há algo de junguiano nessa crítica, e os autores o reconhecem, embora com reservas severas. Ao lembrar a ruptura entre Freud e Jung, eles recuperam o seu ponto de partida: </w:t>
+        <w:t xml:space="preserve">Há algo de junguiano nessa crítica, e os autores o reconhecem, embora com reservas severas. Ao lembrar a ruptura entre Freud e Jung, eles recuperam o seu ponto de partida:</w:t>
       </w:r>
     </w:p>
     <w:p>
@@ -22895,7 +22937,7 @@
           <w:szCs w:val="24"/>
           <w:rtl w:val="0"/>
         </w:rPr>
-        <w:t xml:space="preserve">O que chamou a minha atenção em 2016, e continua a me parecer decisivo, é que os autores descrevem a passagem entre as sínteses em termos explicitamente energéticos: </w:t>
+        <w:t xml:space="preserve">O que chamou a minha atenção em 2016, e continua a me parecer decisivo, é que os autores descrevem a passagem entre as sínteses em termos explicitamente energéticos:</w:t>
       </w:r>
     </w:p>
     <w:p>
@@ -22990,7 +23032,7 @@
           <w:szCs w:val="24"/>
           <w:rtl w:val="0"/>
         </w:rPr>
-        <w:t xml:space="preserve">A terceira síntese reforçava essa intuição. Os autores descrevem o consumo da máquina desejante como um nascimento: </w:t>
+        <w:t xml:space="preserve">A terceira síntese reforçava essa intuição. Os autores descrevem o consumo da máquina desejante como um nascimento:</w:t>
       </w:r>
     </w:p>
     <w:p>
@@ -24777,7 +24819,7 @@
           <w:szCs w:val="24"/>
           <w:rtl w:val="0"/>
         </w:rPr>
-        <w:t xml:space="preserve">O conceito de devir-mulher foi recebido com desconfiança por boa parte do pensamento feminista, e as razões dessa desconfiança precisam ser levadas a sério, porque tocam exatamente no problema em exame. A primeira objeção foi formulada por Alice Jardine, que via na apropriação do feminino pelos filósofos franceses dos anos 1970 — Deleuze entre eles — um novo capítulo da longa história em que o feminino serve como metáfora para os problemas do sujeito masculino. A pergunta com que ela fecha o argumento é direta: </w:t>
+        <w:t xml:space="preserve">O conceito de devir-mulher foi recebido com desconfiança por boa parte do pensamento feminista, e as razões dessa desconfiança precisam ser levadas a sério, porque tocam exatamente no problema em exame. A primeira objeção foi formulada por Alice Jardine, que via na apropriação do feminino pelos filósofos franceses dos anos 1970 — Deleuze entre eles — um novo capítulo da longa história em que o feminino serve como metáfora para os problemas do sujeito masculino. A pergunta com que ela fecha o argumento é direta:</w:t>
       </w:r>
     </w:p>
     <w:p>
@@ -24818,7 +24860,7 @@
           <w:szCs w:val="24"/>
           <w:rtl w:val="0"/>
         </w:rPr>
-        <w:t xml:space="preserve"> [tradução nossa]</w:t>
+        <w:t xml:space="preserve">[tradução nossa]. O devir-mulher seria, nessa leitura, uma operação</w:t>
       </w:r>
       <w:r>
         <w:rPr>
@@ -24834,7 +24876,7 @@
           <w:szCs w:val="24"/>
           <w:rtl w:val="0"/>
         </w:rPr>
-        <w:t xml:space="preserve">. O devir-mulher seria, nessa leitura, uma operação pela qual o homem se renova tomando emprestada a posição da mulher, sem que as mulheres reais ganhem com isso qualquer lugar próprio.</w:t>
+        <w:t xml:space="preserve"> pela qual o homem se renova tomando emprestada a posição da mulher, sem que as mulheres reais ganhem com isso qualquer lugar próprio.</w:t>
       </w:r>
       <w:r>
         <w:rPr>
@@ -24896,7 +24938,7 @@
           <w:szCs w:val="24"/>
           <w:rtl w:val="0"/>
         </w:rPr>
-        <w:t xml:space="preserve">Braidotti, no entanto, não conclui daí pelo abandono de Deleuze. A sua proposta é retomar o conceito de devir a partir da diferença sexual, e não contra ela: o devir-mulher não precisa ser pensado como dissolução das mulheres, mas como processo pelo qual as mulheres reinventam a sua subjetividade fora das definições que o padrão majoritário lhes impôs. Elizabeth Grosz seguiu um caminho análogo e enunciou com precisão o que a ontologia dos corpos de Deleuze e Guattari oferece ao feminismo: </w:t>
+        <w:t xml:space="preserve">Braidotti, no entanto, não conclui daí pelo abandono de Deleuze. A sua proposta é retomar o conceito de devir a partir da diferença sexual, e não contra ela: o devir-mulher não precisa ser pensado como dissolução das mulheres, mas como processo pelo qual as mulheres reinventam a sua subjetividade fora das definições que o padrão majoritário lhes impôs. Elizabeth Grosz seguiu um caminho análogo e enunciou com precisão o que a ontologia dos corpos de Deleuze e Guattari oferece ao feminismo:</w:t>
       </w:r>
     </w:p>
     <w:p>
@@ -24937,7 +24979,7 @@
           <w:szCs w:val="24"/>
           <w:rtl w:val="0"/>
         </w:rPr>
-        <w:t xml:space="preserve"> [tradução nossa]</w:t>
+        <w:t xml:space="preserve">[tradução nossa]. Em ambos os casos, a apropriação feminista de Deleuze</w:t>
       </w:r>
       <w:r>
         <w:rPr>
@@ -24953,7 +24995,7 @@
           <w:szCs w:val="24"/>
           <w:rtl w:val="0"/>
         </w:rPr>
-        <w:t xml:space="preserve">. Em ambos os casos, a apropriação feminista de Deleuze passa por corrigi-lo naquilo em que ele parece reproduzir o gesto que pretendia romper.</w:t>
+        <w:t xml:space="preserve"> passa por corrigi-lo naquilo em que ele parece reproduzir o gesto que pretendia romper.</w:t>
       </w:r>
       <w:r>
         <w:rPr>

</xml_diff>